<commit_message>
[FIX] Validacion REPO v1.0
</commit_message>
<xml_diff>
--- a/fuentes/13530499_CF1_DI.docx
+++ b/fuentes/13530499_CF1_DI.docx
@@ -3002,7 +3002,21 @@
           <w:sz w:val="20"/>
           <w:szCs w:val="20"/>
         </w:rPr>
-        <w:t>Turismo de Aventura</w:t>
+        <w:t xml:space="preserve">Turismo de </w:t>
+      </w:r>
+      <w:r>
+        <w:rPr>
+          <w:sz w:val="20"/>
+          <w:szCs w:val="20"/>
+        </w:rPr>
+        <w:t>a</w:t>
+      </w:r>
+      <w:r>
+        <w:rPr>
+          <w:sz w:val="20"/>
+          <w:szCs w:val="20"/>
+        </w:rPr>
+        <w:t>ventura</w:t>
       </w:r>
       <w:bookmarkEnd w:id="5"/>
     </w:p>
@@ -3379,8 +3393,8 @@
         <w:spacing w:line="360" w:lineRule="auto"/>
         <w:jc w:val="both"/>
         <w:rPr>
-          <w:b/>
-          <w:bCs/>
+          <w:b w:val="1"/>
+          <w:bCs w:val="1"/>
           <w:color w:val="000000"/>
           <w:sz w:val="20"/>
           <w:szCs w:val="20"/>
@@ -3389,14 +3403,47 @@
       </w:pPr>
       <w:r>
         <w:rPr>
-          <w:b/>
-          <w:bCs/>
-          <w:color w:val="000000"/>
+          <w:b w:val="1"/>
+          <w:bCs w:val="1"/>
+          <w:color w:val="000000" w:themeColor="text1" w:themeTint="FF" w:themeShade="FF"/>
           <w:sz w:val="20"/>
           <w:szCs w:val="20"/>
           <w:lang w:val="es-MX"/>
         </w:rPr>
-        <w:t xml:space="preserve">Elementos claves del turismo aventura: </w:t>
+        <w:t>Elementos clave del turismo</w:t>
+      </w:r>
+      <w:r>
+        <w:rPr>
+          <w:b w:val="1"/>
+          <w:bCs w:val="1"/>
+          <w:color w:val="000000" w:themeColor="text1" w:themeTint="FF" w:themeShade="FF"/>
+          <w:sz w:val="20"/>
+          <w:szCs w:val="20"/>
+          <w:lang w:val="es-MX"/>
+        </w:rPr>
+        <w:t xml:space="preserve"> de</w:t>
+      </w:r>
+      <w:r>
+        <w:rPr>
+          <w:b w:val="1"/>
+          <w:bCs w:val="1"/>
+          <w:color w:val="000000" w:themeColor="text1" w:themeTint="FF" w:themeShade="FF"/>
+          <w:sz w:val="20"/>
+          <w:szCs w:val="20"/>
+          <w:lang w:val="es-MX"/>
+        </w:rPr>
+        <w:t xml:space="preserve"> </w:t>
+      </w:r>
+      <w:r>
+        <w:rPr>
+          <w:b w:val="1"/>
+          <w:bCs w:val="1"/>
+          <w:color w:val="000000" w:themeColor="text1" w:themeTint="FF" w:themeShade="FF"/>
+          <w:sz w:val="20"/>
+          <w:szCs w:val="20"/>
+          <w:lang w:val="es-MX"/>
+        </w:rPr>
+        <w:t xml:space="preserve">aventura: </w:t>
       </w:r>
     </w:p>
     <w:p>
@@ -5546,10 +5593,6 @@
     <w:p>
       <w:pPr>
         <w:pStyle w:val="Ttulo2"/>
-        <w:rPr>
-          <w:sz w:val="20"/>
-          <w:szCs w:val="20"/>
-        </w:rPr>
       </w:pPr>
       <w:bookmarkStart w:name="_Toc231503882" w:id="7"/>
       <w:r>
@@ -5584,10 +5627,78 @@
       </w:r>
       <w:bookmarkEnd w:id="7"/>
     </w:p>
+    <w:tbl>
+      <w:tblPr>
+        <w:tblStyle w:val="Tablaconcuadrcula"/>
+        <w:tblW w:w="0" w:type="auto"/>
+        <w:tblLook w:val="06A0" w:firstRow="1" w:lastRow="0" w:firstColumn="1" w:lastColumn="0" w:noHBand="1" w:noVBand="1"/>
+      </w:tblPr>
+      <w:tblGrid>
+        <w:gridCol w:w="9960"/>
+      </w:tblGrid>
+      <w:tr>
+        <w:trPr>
+          <w:trHeight w:val="300"/>
+        </w:trPr>
+        <w:tc>
+          <w:tcPr>
+            <w:tcW w:w="9960" w:type="dxa"/>
+            <w:shd w:val="clear" w:color="auto" w:fill="DAE8F8"/>
+            <w:tcMar/>
+          </w:tcPr>
+          <w:p>
+            <w:pPr>
+              <w:pStyle w:val="Normal"/>
+            </w:pPr>
+            <w:r>
+              <w:rPr>
+                <w:b w:val="1"/>
+                <w:bCs w:val="1"/>
+              </w:rPr>
+              <w:t>¡Es momento de explorar!</w:t>
+            </w:r>
+          </w:p>
+          <w:p>
+            <w:pPr>
+              <w:pStyle w:val="Normal"/>
+              <w:rPr>
+                <w:b w:val="1"/>
+                <w:bCs w:val="1"/>
+              </w:rPr>
+            </w:pPr>
+          </w:p>
+          <w:p>
+            <w:pPr>
+              <w:pStyle w:val="Normal"/>
+            </w:pPr>
+            <w:r>
+              <w:rPr/>
+              <w:t>Reproduzca el podcast sobre infraestructura turística local y descubra los elementos que hacen posible el desarrollo de un destino turístico.</w:t>
+            </w:r>
+          </w:p>
+          <w:p>
+            <w:pPr>
+              <w:pStyle w:val="Normal"/>
+            </w:pPr>
+          </w:p>
+        </w:tc>
+      </w:tr>
+    </w:tbl>
+    <w:p>
+      <w:pPr>
+        <w:pStyle w:val="Normal"/>
+        <w:suppressLineNumbers w:val="0"/>
+        <w:bidi w:val="0"/>
+        <w:spacing w:before="0" w:beforeAutospacing="off" w:after="0" w:afterAutospacing="off" w:line="276" w:lineRule="auto"/>
+        <w:ind w:left="0" w:right="0"/>
+        <w:jc w:val="left"/>
+      </w:pPr>
+    </w:p>
     <w:p>
       <w:pPr>
         <w:pStyle w:val="NormalWeb"/>
         <w:spacing w:line="360" w:lineRule="auto"/>
+        <w:ind w:left="0"/>
         <w:rPr>
           <w:rFonts w:ascii="Arial" w:hAnsi="Arial" w:cs="Arial"/>
           <w:sz w:val="20"/>
@@ -6949,7 +7060,7 @@
           <w:ilvl w:val="0"/>
           <w:numId w:val="22"/>
         </w:numPr>
-        <w:spacing w:before="100" w:beforeAutospacing="1" w:after="100" w:afterAutospacing="1" w:line="360" w:lineRule="auto"/>
+        <w:spacing w:before="100" w:beforeAutospacing="on" w:after="100" w:afterAutospacing="on" w:line="360" w:lineRule="auto"/>
         <w:rPr>
           <w:rFonts w:eastAsia="Times New Roman"/>
           <w:sz w:val="20"/>
@@ -6962,7 +7073,23 @@
           <w:sz w:val="20"/>
           <w:szCs w:val="20"/>
         </w:rPr>
-        <w:t xml:space="preserve">regular la prestación de servicios turísticos, </w:t>
+        <w:t>R</w:t>
+      </w:r>
+      <w:r>
+        <w:rPr>
+          <w:rFonts w:eastAsia="Times New Roman"/>
+          <w:sz w:val="20"/>
+          <w:szCs w:val="20"/>
+        </w:rPr>
+        <w:t>egular la prestación de servicios turísticos</w:t>
+      </w:r>
+      <w:r>
+        <w:rPr>
+          <w:rFonts w:eastAsia="Times New Roman"/>
+          <w:sz w:val="20"/>
+          <w:szCs w:val="20"/>
+        </w:rPr>
+        <w:t>.</w:t>
       </w:r>
     </w:p>
     <w:p>
@@ -6971,7 +7098,7 @@
           <w:ilvl w:val="0"/>
           <w:numId w:val="22"/>
         </w:numPr>
-        <w:spacing w:before="100" w:beforeAutospacing="1" w:after="100" w:afterAutospacing="1" w:line="360" w:lineRule="auto"/>
+        <w:spacing w:before="100" w:beforeAutospacing="on" w:after="100" w:afterAutospacing="on" w:line="360" w:lineRule="auto"/>
         <w:rPr>
           <w:rFonts w:eastAsia="Times New Roman"/>
           <w:sz w:val="20"/>
@@ -6984,7 +7111,23 @@
           <w:sz w:val="20"/>
           <w:szCs w:val="20"/>
         </w:rPr>
-        <w:t xml:space="preserve">garantizar condiciones de seguridad, </w:t>
+        <w:t>G</w:t>
+      </w:r>
+      <w:r>
+        <w:rPr>
+          <w:rFonts w:eastAsia="Times New Roman"/>
+          <w:sz w:val="20"/>
+          <w:szCs w:val="20"/>
+        </w:rPr>
+        <w:t>arantizar condiciones de seguridad</w:t>
+      </w:r>
+      <w:r>
+        <w:rPr>
+          <w:rFonts w:eastAsia="Times New Roman"/>
+          <w:sz w:val="20"/>
+          <w:szCs w:val="20"/>
+        </w:rPr>
+        <w:t>.</w:t>
       </w:r>
     </w:p>
     <w:p>
@@ -6993,7 +7136,7 @@
           <w:ilvl w:val="0"/>
           <w:numId w:val="22"/>
         </w:numPr>
-        <w:spacing w:before="100" w:beforeAutospacing="1" w:after="100" w:afterAutospacing="1" w:line="360" w:lineRule="auto"/>
+        <w:spacing w:before="100" w:beforeAutospacing="on" w:after="100" w:afterAutospacing="on" w:line="360" w:lineRule="auto"/>
         <w:rPr>
           <w:rFonts w:eastAsia="Times New Roman"/>
           <w:sz w:val="20"/>
@@ -7006,7 +7149,23 @@
           <w:sz w:val="20"/>
           <w:szCs w:val="20"/>
         </w:rPr>
-        <w:t xml:space="preserve">promover buenas prácticas ambientales, </w:t>
+        <w:t>P</w:t>
+      </w:r>
+      <w:r>
+        <w:rPr>
+          <w:rFonts w:eastAsia="Times New Roman"/>
+          <w:sz w:val="20"/>
+          <w:szCs w:val="20"/>
+        </w:rPr>
+        <w:t>romover buenas prácticas ambientales</w:t>
+      </w:r>
+      <w:r>
+        <w:rPr>
+          <w:rFonts w:eastAsia="Times New Roman"/>
+          <w:sz w:val="20"/>
+          <w:szCs w:val="20"/>
+        </w:rPr>
+        <w:t>.</w:t>
       </w:r>
     </w:p>
     <w:p>
@@ -7015,7 +7174,7 @@
           <w:ilvl w:val="0"/>
           <w:numId w:val="22"/>
         </w:numPr>
-        <w:spacing w:before="100" w:beforeAutospacing="1" w:after="100" w:afterAutospacing="1" w:line="360" w:lineRule="auto"/>
+        <w:spacing w:before="100" w:beforeAutospacing="on" w:after="100" w:afterAutospacing="on" w:line="360" w:lineRule="auto"/>
         <w:rPr>
           <w:rFonts w:eastAsia="Times New Roman"/>
           <w:sz w:val="20"/>
@@ -7028,7 +7187,23 @@
           <w:sz w:val="20"/>
           <w:szCs w:val="20"/>
         </w:rPr>
-        <w:t xml:space="preserve">fortalecer la calidad de la experiencia turística, </w:t>
+        <w:t>F</w:t>
+      </w:r>
+      <w:r>
+        <w:rPr>
+          <w:rFonts w:eastAsia="Times New Roman"/>
+          <w:sz w:val="20"/>
+          <w:szCs w:val="20"/>
+        </w:rPr>
+        <w:t>ortalecer la calidad de la experiencia turística</w:t>
+      </w:r>
+      <w:r>
+        <w:rPr>
+          <w:rFonts w:eastAsia="Times New Roman"/>
+          <w:sz w:val="20"/>
+          <w:szCs w:val="20"/>
+        </w:rPr>
+        <w:t>.</w:t>
       </w:r>
     </w:p>
     <w:p>
@@ -7037,7 +7212,7 @@
           <w:ilvl w:val="0"/>
           <w:numId w:val="22"/>
         </w:numPr>
-        <w:spacing w:before="100" w:beforeAutospacing="1" w:after="100" w:afterAutospacing="1" w:line="360" w:lineRule="auto"/>
+        <w:spacing w:before="100" w:beforeAutospacing="on" w:after="100" w:afterAutospacing="on" w:line="360" w:lineRule="auto"/>
         <w:rPr>
           <w:rFonts w:eastAsia="Times New Roman"/>
           <w:sz w:val="20"/>
@@ -7050,7 +7225,15 @@
           <w:sz w:val="20"/>
           <w:szCs w:val="20"/>
         </w:rPr>
-        <w:t xml:space="preserve">y prevenir accidentes y situaciones de riesgo. </w:t>
+        <w:t>P</w:t>
+      </w:r>
+      <w:r>
+        <w:rPr>
+          <w:rFonts w:eastAsia="Times New Roman"/>
+          <w:sz w:val="20"/>
+          <w:szCs w:val="20"/>
+        </w:rPr>
+        <w:t xml:space="preserve">revenir accidentes y situaciones de riesgo. </w:t>
       </w:r>
     </w:p>
     <w:p>
@@ -9231,6 +9414,7 @@
         <w:tc>
           <w:tcPr>
             <w:tcW w:w="4981" w:type="dxa"/>
+            <w:tcMar/>
           </w:tcPr>
           <w:p>
             <w:pPr>
@@ -9257,6 +9441,7 @@
         <w:tc>
           <w:tcPr>
             <w:tcW w:w="4981" w:type="dxa"/>
+            <w:tcMar/>
           </w:tcPr>
           <w:p>
             <w:pPr>
@@ -9285,6 +9470,7 @@
         <w:tc>
           <w:tcPr>
             <w:tcW w:w="4981" w:type="dxa"/>
+            <w:tcMar/>
           </w:tcPr>
           <w:p>
             <w:pPr>
@@ -9307,6 +9493,7 @@
         <w:tc>
           <w:tcPr>
             <w:tcW w:w="4981" w:type="dxa"/>
+            <w:tcMar/>
           </w:tcPr>
           <w:p>
             <w:pPr>
@@ -9331,6 +9518,7 @@
         <w:tc>
           <w:tcPr>
             <w:tcW w:w="4981" w:type="dxa"/>
+            <w:tcMar/>
           </w:tcPr>
           <w:p>
             <w:pPr>
@@ -9353,6 +9541,7 @@
         <w:tc>
           <w:tcPr>
             <w:tcW w:w="4981" w:type="dxa"/>
+            <w:tcMar/>
           </w:tcPr>
           <w:p>
             <w:pPr>
@@ -9377,6 +9566,7 @@
         <w:tc>
           <w:tcPr>
             <w:tcW w:w="4981" w:type="dxa"/>
+            <w:tcMar/>
           </w:tcPr>
           <w:p>
             <w:pPr>
@@ -9399,6 +9589,7 @@
         <w:tc>
           <w:tcPr>
             <w:tcW w:w="4981" w:type="dxa"/>
+            <w:tcMar/>
           </w:tcPr>
           <w:p>
             <w:pPr>
@@ -9423,6 +9614,7 @@
         <w:tc>
           <w:tcPr>
             <w:tcW w:w="4981" w:type="dxa"/>
+            <w:tcMar/>
           </w:tcPr>
           <w:p>
             <w:pPr>
@@ -9445,6 +9637,7 @@
         <w:tc>
           <w:tcPr>
             <w:tcW w:w="4981" w:type="dxa"/>
+            <w:tcMar/>
           </w:tcPr>
           <w:p>
             <w:pPr>
@@ -9469,6 +9662,7 @@
         <w:tc>
           <w:tcPr>
             <w:tcW w:w="4981" w:type="dxa"/>
+            <w:tcMar/>
           </w:tcPr>
           <w:p>
             <w:pPr>
@@ -9491,6 +9685,7 @@
         <w:tc>
           <w:tcPr>
             <w:tcW w:w="4981" w:type="dxa"/>
+            <w:tcMar/>
           </w:tcPr>
           <w:p>
             <w:pPr>
@@ -9506,7 +9701,25 @@
                 <w:szCs w:val="20"/>
                 <w:lang w:val="es-MX" w:eastAsia="es-MX"/>
               </w:rPr>
-              <w:t>Comunidades indígenas, negras, raizales y ROM.</w:t>
+              <w:t xml:space="preserve">Comunidades indígenas, negras, raizales y </w:t>
+            </w:r>
+            <w:r>
+              <w:rPr>
+                <w:rFonts w:eastAsia="Times New Roman"/>
+                <w:sz w:val="20"/>
+                <w:szCs w:val="20"/>
+                <w:lang w:val="es-MX" w:eastAsia="es-MX"/>
+              </w:rPr>
+              <w:t>Rrom</w:t>
+            </w:r>
+            <w:r>
+              <w:rPr>
+                <w:rFonts w:eastAsia="Times New Roman"/>
+                <w:sz w:val="20"/>
+                <w:szCs w:val="20"/>
+                <w:lang w:val="es-MX" w:eastAsia="es-MX"/>
+              </w:rPr>
+              <w:t>.</w:t>
             </w:r>
           </w:p>
         </w:tc>
@@ -9598,8 +9811,8 @@
       </w:pPr>
       <w:r>
         <w:rPr>
-          <w:b/>
-          <w:bCs/>
+          <w:b w:val="1"/>
+          <w:bCs w:val="1"/>
           <w:sz w:val="20"/>
           <w:szCs w:val="20"/>
         </w:rPr>
@@ -9610,7 +9823,21 @@
           <w:sz w:val="20"/>
           <w:szCs w:val="20"/>
         </w:rPr>
-        <w:t xml:space="preserve"> Clasificación sitios naturales</w:t>
+        <w:t xml:space="preserve"> Clasificación </w:t>
+      </w:r>
+      <w:r>
+        <w:rPr>
+          <w:sz w:val="20"/>
+          <w:szCs w:val="20"/>
+        </w:rPr>
+        <w:t xml:space="preserve">de </w:t>
+      </w:r>
+      <w:r>
+        <w:rPr>
+          <w:sz w:val="20"/>
+          <w:szCs w:val="20"/>
+        </w:rPr>
+        <w:t>sitios naturales</w:t>
       </w:r>
     </w:p>
     <w:tbl>
@@ -15600,8 +15827,8 @@
         <w:spacing w:line="360" w:lineRule="auto"/>
         <w:jc w:val="both"/>
         <w:rPr>
-          <w:b/>
-          <w:bCs/>
+          <w:b w:val="1"/>
+          <w:bCs w:val="1"/>
           <w:sz w:val="20"/>
           <w:szCs w:val="20"/>
           <w:lang w:val="es-MX"/>
@@ -15609,8 +15836,8 @@
       </w:pPr>
       <w:r>
         <w:rPr>
-          <w:b/>
-          <w:bCs/>
+          <w:b w:val="1"/>
+          <w:bCs w:val="1"/>
           <w:sz w:val="20"/>
           <w:szCs w:val="20"/>
           <w:highlight w:val="cyan"/>
@@ -15624,7 +15851,39 @@
           <w:szCs w:val="20"/>
           <w:lang w:val="es-MX"/>
         </w:rPr>
-        <w:t xml:space="preserve"> un interés creciente por experiencias responsables con: el medio ambiente, las comunidades locales, la conservación cultural. </w:t>
+        <w:t xml:space="preserve"> un interés creciente por experiencias responsables con</w:t>
+      </w:r>
+      <w:r>
+        <w:rPr>
+          <w:sz w:val="20"/>
+          <w:szCs w:val="20"/>
+          <w:lang w:val="es-MX"/>
+        </w:rPr>
+        <w:t xml:space="preserve"> </w:t>
+      </w:r>
+      <w:r>
+        <w:rPr>
+          <w:sz w:val="20"/>
+          <w:szCs w:val="20"/>
+          <w:lang w:val="es-MX"/>
+        </w:rPr>
+        <w:t>el medio ambiente, las comunidades locales</w:t>
+      </w:r>
+      <w:r>
+        <w:rPr>
+          <w:sz w:val="20"/>
+          <w:szCs w:val="20"/>
+          <w:lang w:val="es-MX"/>
+        </w:rPr>
+        <w:t xml:space="preserve"> y</w:t>
+      </w:r>
+      <w:r>
+        <w:rPr>
+          <w:sz w:val="20"/>
+          <w:szCs w:val="20"/>
+          <w:lang w:val="es-MX"/>
+        </w:rPr>
+        <w:t xml:space="preserve"> la conservación cultural. </w:t>
       </w:r>
     </w:p>
     <w:p>
@@ -15678,8 +15937,8 @@
       </w:pPr>
       <w:r>
         <w:rPr>
-          <w:b/>
-          <w:bCs/>
+          <w:b w:val="1"/>
+          <w:bCs w:val="1"/>
           <w:sz w:val="20"/>
           <w:szCs w:val="20"/>
           <w:lang w:val="es-MX"/>
@@ -15692,7 +15951,39 @@
           <w:szCs w:val="20"/>
           <w:lang w:val="es-MX"/>
         </w:rPr>
-        <w:t>aunque muchas experiencias buscan desconexión, las personas turistas continúan utilizando herramientas digitales para: reservas, navegación, fotografía, consulta de información, recomendaciones.</w:t>
+        <w:t>aunque muchas experiencias buscan desconexión, las personas turistas continúan utilizando herramientas digitales para</w:t>
+      </w:r>
+      <w:r>
+        <w:rPr>
+          <w:sz w:val="20"/>
+          <w:szCs w:val="20"/>
+          <w:lang w:val="es-MX"/>
+        </w:rPr>
+        <w:t xml:space="preserve"> </w:t>
+      </w:r>
+      <w:r>
+        <w:rPr>
+          <w:sz w:val="20"/>
+          <w:szCs w:val="20"/>
+          <w:lang w:val="es-MX"/>
+        </w:rPr>
+        <w:t>reservas, navegación, fotografía, consulta de información</w:t>
+      </w:r>
+      <w:r>
+        <w:rPr>
+          <w:sz w:val="20"/>
+          <w:szCs w:val="20"/>
+          <w:lang w:val="es-MX"/>
+        </w:rPr>
+        <w:t xml:space="preserve"> y</w:t>
+      </w:r>
+      <w:r>
+        <w:rPr>
+          <w:sz w:val="20"/>
+          <w:szCs w:val="20"/>
+          <w:lang w:val="es-MX"/>
+        </w:rPr>
+        <w:t xml:space="preserve"> recomendaciones.</w:t>
       </w:r>
     </w:p>
     <w:p>
@@ -18352,19 +18643,46 @@
         <w:pStyle w:val="NormalWeb"/>
         <w:spacing w:line="360" w:lineRule="auto"/>
         <w:ind w:left="720" w:hanging="720"/>
+      </w:pPr>
+      <w:r>
         <w:rPr>
           <w:rFonts w:ascii="Arial" w:hAnsi="Arial" w:cs="Arial"/>
           <w:sz w:val="20"/>
           <w:szCs w:val="20"/>
         </w:rPr>
-      </w:pPr>
+        <w:t xml:space="preserve">Adventure Travel </w:t>
+      </w:r>
       <w:r>
         <w:rPr>
           <w:rFonts w:ascii="Arial" w:hAnsi="Arial" w:cs="Arial"/>
           <w:sz w:val="20"/>
           <w:szCs w:val="20"/>
         </w:rPr>
-        <w:t xml:space="preserve">Adventure Travel Trade Association. (2023). </w:t>
+        <w:t>Trade</w:t>
+      </w:r>
+      <w:r>
+        <w:rPr>
+          <w:rFonts w:ascii="Arial" w:hAnsi="Arial" w:cs="Arial"/>
+          <w:sz w:val="20"/>
+          <w:szCs w:val="20"/>
+        </w:rPr>
+        <w:t xml:space="preserve"> </w:t>
+      </w:r>
+      <w:r>
+        <w:rPr>
+          <w:rFonts w:ascii="Arial" w:hAnsi="Arial" w:cs="Arial"/>
+          <w:sz w:val="20"/>
+          <w:szCs w:val="20"/>
+        </w:rPr>
+        <w:t>Association</w:t>
+      </w:r>
+      <w:r>
+        <w:rPr>
+          <w:rFonts w:ascii="Arial" w:hAnsi="Arial" w:cs="Arial"/>
+          <w:sz w:val="20"/>
+          <w:szCs w:val="20"/>
+        </w:rPr>
+        <w:t xml:space="preserve">. (2023). </w:t>
       </w:r>
       <w:r>
         <w:rPr>
@@ -18373,15 +18691,60 @@
           <w:sz w:val="20"/>
           <w:szCs w:val="20"/>
         </w:rPr>
-        <w:t>Adventure travel trends and insights</w:t>
-      </w:r>
-      <w:r>
-        <w:rPr>
+        <w:t xml:space="preserve">Adventure </w:t>
+      </w:r>
+      <w:r>
+        <w:rPr>
+          <w:rStyle w:val="nfasis"/>
           <w:rFonts w:ascii="Arial" w:hAnsi="Arial" w:cs="Arial"/>
           <w:sz w:val="20"/>
           <w:szCs w:val="20"/>
         </w:rPr>
-        <w:t>. Adventure Travel Trade Association.</w:t>
+        <w:t>travel</w:t>
+      </w:r>
+      <w:r>
+        <w:rPr>
+          <w:rStyle w:val="nfasis"/>
+          <w:rFonts w:ascii="Arial" w:hAnsi="Arial" w:cs="Arial"/>
+          <w:sz w:val="20"/>
+          <w:szCs w:val="20"/>
+        </w:rPr>
+        <w:t xml:space="preserve"> </w:t>
+      </w:r>
+      <w:r>
+        <w:rPr>
+          <w:rStyle w:val="nfasis"/>
+          <w:rFonts w:ascii="Arial" w:hAnsi="Arial" w:cs="Arial"/>
+          <w:sz w:val="20"/>
+          <w:szCs w:val="20"/>
+        </w:rPr>
+        <w:t>trends</w:t>
+      </w:r>
+      <w:r>
+        <w:rPr>
+          <w:rStyle w:val="nfasis"/>
+          <w:rFonts w:ascii="Arial" w:hAnsi="Arial" w:cs="Arial"/>
+          <w:sz w:val="20"/>
+          <w:szCs w:val="20"/>
+        </w:rPr>
+        <w:t xml:space="preserve"> and </w:t>
+      </w:r>
+      <w:r>
+        <w:rPr>
+          <w:rStyle w:val="nfasis"/>
+          <w:rFonts w:ascii="Arial" w:hAnsi="Arial" w:cs="Arial"/>
+          <w:sz w:val="20"/>
+          <w:szCs w:val="20"/>
+        </w:rPr>
+        <w:t>insights</w:t>
+      </w:r>
+      <w:r>
+        <w:rPr>
+          <w:rFonts w:ascii="Arial" w:hAnsi="Arial" w:cs="Arial"/>
+          <w:sz w:val="20"/>
+          <w:szCs w:val="20"/>
+        </w:rPr>
+        <w:t xml:space="preserve">. </w:t>
       </w:r>
     </w:p>
     <w:p>
@@ -18475,7 +18838,15 @@
           <w:sz w:val="20"/>
           <w:szCs w:val="20"/>
         </w:rPr>
-        <w:t xml:space="preserve">Colombia, Congreso de la República. (1996). </w:t>
+        <w:t>Congreso de la República de Colombia</w:t>
+      </w:r>
+      <w:r>
+        <w:rPr>
+          <w:rFonts w:ascii="Arial" w:hAnsi="Arial" w:cs="Arial"/>
+          <w:sz w:val="20"/>
+          <w:szCs w:val="20"/>
+        </w:rPr>
+        <w:t xml:space="preserve">. (1996). </w:t>
       </w:r>
       <w:r>
         <w:rPr>
@@ -18512,7 +18883,15 @@
           <w:sz w:val="20"/>
           <w:szCs w:val="20"/>
         </w:rPr>
-        <w:t xml:space="preserve">Colombia, Congreso de la República. (2012). </w:t>
+        <w:t>Congreso de la República de Colombia</w:t>
+      </w:r>
+      <w:r>
+        <w:rPr>
+          <w:rFonts w:ascii="Arial" w:hAnsi="Arial" w:cs="Arial"/>
+          <w:sz w:val="20"/>
+          <w:szCs w:val="20"/>
+        </w:rPr>
+        <w:t xml:space="preserve">. (2012). </w:t>
       </w:r>
       <w:r>
         <w:rPr>
@@ -18796,29 +19175,35 @@
         <w:pStyle w:val="NormalWeb"/>
         <w:spacing w:line="360" w:lineRule="auto"/>
         <w:ind w:left="720" w:hanging="720"/>
+      </w:pPr>
+      <w:r>
         <w:rPr>
           <w:rFonts w:ascii="Arial" w:hAnsi="Arial" w:cs="Arial"/>
           <w:sz w:val="20"/>
           <w:szCs w:val="20"/>
         </w:rPr>
-      </w:pPr>
+        <w:t xml:space="preserve">Urquía &amp; Bas. (s. f.). </w:t>
+      </w:r>
       <w:r>
         <w:rPr>
           <w:rFonts w:ascii="Arial" w:hAnsi="Arial" w:cs="Arial"/>
           <w:sz w:val="20"/>
           <w:szCs w:val="20"/>
         </w:rPr>
-        <w:t xml:space="preserve">Urquía &amp; Bas. (s. f.). </w:t>
-      </w:r>
-      <w:r>
+        <w:t>El consentimiento informado: ¿Conoces por qué lo debes utilizar?</w:t>
+      </w:r>
+    </w:p>
+    <w:p>
+      <w:pPr>
+        <w:pStyle w:val="NormalWeb"/>
+        <w:spacing w:line="360" w:lineRule="auto"/>
+        <w:ind w:left="720" w:hanging="720"/>
         <w:rPr>
           <w:rFonts w:ascii="Arial" w:hAnsi="Arial" w:cs="Arial"/>
-          <w:i/>
-          <w:sz w:val="20"/>
-          <w:szCs w:val="20"/>
-        </w:rPr>
-        <w:t>Consentimiento informado: ¿Conoces lo que debes utilizar?</w:t>
-      </w:r>
+          <w:sz w:val="20"/>
+          <w:szCs w:val="20"/>
+        </w:rPr>
+      </w:pPr>
     </w:p>
     <w:p>
       <w:pPr>

</xml_diff>

<commit_message>
[FIX] Validacion REPO v1.1
</commit_message>
<xml_diff>
--- a/fuentes/13530499_CF1_DI.docx
+++ b/fuentes/13530499_CF1_DI.docx
@@ -16317,10 +16317,7 @@
       <w:commentRangeEnd w:id="25"/>
       <w:r>
         <w:rPr>
-          <w:rStyle w:val="Refdecomentario"/>
-          <w:sz w:val="20"/>
-          <w:szCs w:val="20"/>
-          <w:lang w:eastAsia="ja-JP"/>
+          <w:rStyle w:val="CommentReference"/>
         </w:rPr>
         <w:commentReference w:id="25"/>
       </w:r>
@@ -18953,36 +18950,14 @@
         <w:pStyle w:val="NormalWeb"/>
         <w:spacing w:line="360" w:lineRule="auto"/>
         <w:ind w:left="720" w:hanging="720"/>
+      </w:pPr>
+      <w:r>
         <w:rPr>
           <w:rFonts w:ascii="Arial" w:hAnsi="Arial" w:cs="Arial"/>
           <w:sz w:val="20"/>
           <w:szCs w:val="20"/>
         </w:rPr>
-      </w:pPr>
-      <w:r>
-        <w:rPr>
-          <w:rFonts w:ascii="Arial" w:hAnsi="Arial" w:cs="Arial"/>
-          <w:sz w:val="20"/>
-          <w:szCs w:val="20"/>
-        </w:rPr>
-        <w:t xml:space="preserve">Ministerio de Comercio, Industria y Turismo. (2015). </w:t>
-      </w:r>
-      <w:r>
-        <w:rPr>
-          <w:rStyle w:val="nfasis"/>
-          <w:rFonts w:ascii="Arial" w:hAnsi="Arial" w:cs="Arial"/>
-          <w:sz w:val="20"/>
-          <w:szCs w:val="20"/>
-        </w:rPr>
-        <w:t>Decreto 1074 de 2015. Decreto Único Reglamentario del Sector Comercio, Industria y Turismo</w:t>
-      </w:r>
-      <w:r>
-        <w:rPr>
-          <w:rFonts w:ascii="Arial" w:hAnsi="Arial" w:cs="Arial"/>
-          <w:sz w:val="20"/>
-          <w:szCs w:val="20"/>
-        </w:rPr>
-        <w:t>. Diario Oficial No. 49.523.</w:t>
+        <w:t>Presidencia de la República de Colombia. (2015, 26 de mayo). Decreto 1074 de 2015: Por medio del cual se expide el Decreto Único Reglamentario del Sector Comercio, Industria y Turismo. Diario Oficial No. 49.523.</w:t>
       </w:r>
     </w:p>
     <w:p>
@@ -20100,22 +20075,19 @@
       </w:r>
     </w:p>
   </w:comment>
-  <w:comment w:initials="EFM" w:author="Erika Fernanda Mejía" w:date="2026-06-04T22:36:00Z" w:id="25">
-    <w:p>
-      <w:pPr>
-        <w:pStyle w:val="Textocomentario"/>
-      </w:pPr>
-      <w:r>
-        <w:rPr>
-          <w:rStyle w:val="Refdecomentario"/>
+  <w:comment xmlns:w="http://schemas.openxmlformats.org/wordprocessingml/2006/main" w:initials="EFM" w:author="Erika Fernanda Mejía" w:date="06/04/2026 15:36:00" w:id="25">
+    <w:p xmlns:w14="http://schemas.microsoft.com/office/word/2010/wordml">
+      <w:pPr>
+        <w:pStyle w:val="CommentText"/>
+      </w:pPr>
+      <w:r>
+        <w:rPr>
+          <w:rStyle w:val="CommentReference"/>
         </w:rPr>
         <w:annotationRef/>
       </w:r>
       <w:r>
-        <w:t>M</w:t>
-      </w:r>
-      <w:r>
-        <w:t>uestra sus principales componentes: destino turístico, gestión y regulación, potencial del territorio y cliente, con elementos como infraestructura, seguridad, normatividad, atractivos naturales y culturales, y motivaciones del visitante.</w:t>
+        <w:t>Se presentan los cuatro componentes principales del turismo de aventura: destino turístico, gestión y regulación, potencial del territorio y cliente, con elementos como infraestructura, seguridad, normatividad, atractivos naturales y culturales, y motivaciones del visitante.</w:t>
       </w:r>
     </w:p>
   </w:comment>
@@ -20197,7 +20169,19 @@
   <w16cex:commentExtensible w16cex:durableId="2DCC75E0" w16cex:dateUtc="2026-06-05T03:08:00Z"/>
   <w16cex:commentExtensible w16cex:durableId="2DCC67D7" w16cex:dateUtc="2026-06-05T02:08:00Z"/>
   <w16cex:commentExtensible w16cex:durableId="2DCC75EC" w16cex:dateUtc="2026-06-05T03:08:00Z"/>
-  <w16cex:commentExtensible w16cex:durableId="2DCC7C7A" w16cex:dateUtc="2026-06-05T03:36:00Z"/>
+  <w16cex:commentExtensible w16cex:durableId="2DCC7C7A" w16cex:dateUtc="2026-06-05T03:36:00Z">
+    <w16cex:extLst>
+      <w16:ext w16:uri="{CE6994B0-6A32-4C9F-8C6B-6E91EDA988CE}">
+        <cr:reactions xmlns:cr="http://schemas.microsoft.com/office/comments/2020/reactions">
+          <cr:reaction reactionType="1">
+            <cr:reactionInfo dateUtc="2026-09-22T14:51:33.363Z">
+              <cr:user userId="S::slcristancho@sena.edu.co::e9252f26-10d4-41db-817c-7aaa587b63e6" userProvider="AD" userName="Sandra Liliana Cristancho Cruz"/>
+            </cr:reactionInfo>
+          </cr:reaction>
+        </cr:reactions>
+      </w16:ext>
+    </w16cex:extLst>
+  </w16cex:commentExtensible>
   <w16cex:commentExtensible w16cex:durableId="6DA72B63" w16cex:dateUtc="2026-06-06T18:06:14.546Z"/>
   <w16cex:commentExtensible w16cex:durableId="68392DEB" w16cex:dateUtc="2026-08-11T14:05:46.749Z"/>
 </w16cex:commentsExtensible>
@@ -43373,8 +43357,8 @@
 </file>
 
 <file path=customXml/item4.xml><?xml version="1.0" encoding="utf-8"?>
-<ct:contentTypeSchema xmlns:ct="http://schemas.microsoft.com/office/2006/metadata/contentType" xmlns:ma="http://schemas.microsoft.com/office/2006/metadata/properties/metaAttributes" ct:_="" ma:_="" ma:contentTypeName="Documento" ma:contentTypeID="0x01010005252A1EF3BD024F856B47B579AB5244" ma:contentTypeVersion="12" ma:contentTypeDescription="Crear nuevo documento." ma:contentTypeScope="" ma:versionID="32d0e18b85ac20c34eab62df21c0cf58">
-  <xsd:schema xmlns:xsd="http://www.w3.org/2001/XMLSchema" xmlns:xs="http://www.w3.org/2001/XMLSchema" xmlns:p="http://schemas.microsoft.com/office/2006/metadata/properties" xmlns:ns2="42760c81-fd8e-4d59-8953-7cdb9f38b14f" xmlns:ns3="67a0edcd-0de5-43ed-8c27-e32f38a00c91" targetNamespace="http://schemas.microsoft.com/office/2006/metadata/properties" ma:root="true" ma:fieldsID="cc2c149e99f10870fd5bc3964e5386d3" ns2:_="" ns3:_="">
+<ct:contentTypeSchema xmlns:ct="http://schemas.microsoft.com/office/2006/metadata/contentType" xmlns:ma="http://schemas.microsoft.com/office/2006/metadata/properties/metaAttributes" ct:_="" ma:_="" ma:contentTypeName="Documento" ma:contentTypeID="0x01010005252A1EF3BD024F856B47B579AB5244" ma:contentTypeVersion="13" ma:contentTypeDescription="Crear nuevo documento." ma:contentTypeScope="" ma:versionID="ddfaac56a287547bce89452cd31c5884">
+  <xsd:schema xmlns:xsd="http://www.w3.org/2001/XMLSchema" xmlns:xs="http://www.w3.org/2001/XMLSchema" xmlns:p="http://schemas.microsoft.com/office/2006/metadata/properties" xmlns:ns2="42760c81-fd8e-4d59-8953-7cdb9f38b14f" xmlns:ns3="67a0edcd-0de5-43ed-8c27-e32f38a00c91" targetNamespace="http://schemas.microsoft.com/office/2006/metadata/properties" ma:root="true" ma:fieldsID="5ac878f7c8dbf4633d03f1982e859186" ns2:_="" ns3:_="">
     <xsd:import namespace="42760c81-fd8e-4d59-8953-7cdb9f38b14f"/>
     <xsd:import namespace="67a0edcd-0de5-43ed-8c27-e32f38a00c91"/>
     <xsd:element name="properties">
@@ -43394,6 +43378,7 @@
                 <xsd:element ref="ns3:TaxCatchAll" minOccurs="0"/>
                 <xsd:element ref="ns2:MediaServiceOCR" minOccurs="0"/>
                 <xsd:element ref="ns2:MediaServiceLocation" minOccurs="0"/>
+                <xsd:element ref="ns2:MediaServiceBillingMetadata" minOccurs="0"/>
               </xsd:all>
             </xsd:complexType>
           </xsd:element>
@@ -43456,6 +43441,11 @@
     <xsd:element name="MediaServiceLocation" ma:index="19" nillable="true" ma:displayName="Location" ma:description="" ma:indexed="true" ma:internalName="MediaServiceLocation" ma:readOnly="true">
       <xsd:simpleType>
         <xsd:restriction base="dms:Text"/>
+      </xsd:simpleType>
+    </xsd:element>
+    <xsd:element name="MediaServiceBillingMetadata" ma:index="20" nillable="true" ma:displayName="MediaServiceBillingMetadata" ma:hidden="true" ma:internalName="MediaServiceBillingMetadata" ma:readOnly="true">
+      <xsd:simpleType>
+        <xsd:restriction base="dms:Note"/>
       </xsd:simpleType>
     </xsd:element>
   </xsd:schema>
@@ -43610,7 +43600,7 @@
 </file>
 
 <file path=customXml/itemProps4.xml><?xml version="1.0" encoding="utf-8"?>
-<ds:datastoreItem xmlns:ds="http://schemas.openxmlformats.org/officeDocument/2006/customXml" ds:itemID="{370072F2-13AE-4B48-AEED-3EE7E3EAF064}"/>
+<ds:datastoreItem xmlns:ds="http://schemas.openxmlformats.org/officeDocument/2006/customXml" ds:itemID="{DB875C70-65D5-4BAA-9776-23B0F05EE6A8}"/>
 </file>
 
 <file path=customXml/itemProps5.xml><?xml version="1.0" encoding="utf-8"?>

</xml_diff>